<commit_message>
fix(tests): supprime .env.test redondant et l'ajoute au .gitignore
</commit_message>
<xml_diff>
--- a/Audit_GLF.docx
+++ b/Audit_GLF.docx
@@ -866,7 +866,7 @@
               <w:bottom w:val="single" w:color="CCCCCC" w:sz="1"/>
               <w:right w:val="single" w:color="CCCCCC" w:sz="1"/>
             </w:tcBorders>
-            <w:shd w:fill="FADBD8" w:val="clear"/>
+            <w:shd w:fill="D5F5E3" w:val="clear"/>
             <w:tcMar>
               <w:top w:type="dxa" w:w="80"/>
               <w:left w:type="dxa" w:w="120"/>
@@ -884,11 +884,11 @@
                 <w:rFonts w:ascii="Arial" w:cs="Arial" w:eastAsia="Arial" w:hAnsi="Arial"/>
                 <w:b/>
                 <w:bCs/>
-                <w:color w:val="C0392B"/>
+                <w:color w:val="1E8449"/>
                 <w:sz w:val="18"/>
                 <w:szCs w:val="18"/>
               </w:rPr>
-              <w:t xml:space="preserve">CRITIQUE</w:t>
+              <w:t xml:space="preserve">✓ CORRIGÉ</w:t>
             </w:r>
           </w:p>
         </w:tc>
@@ -901,6 +901,7 @@
               <w:bottom w:val="single" w:color="CCCCCC" w:sz="1"/>
               <w:right w:val="single" w:color="CCCCCC" w:sz="1"/>
             </w:tcBorders>
+            <w:shd w:fill="D5F5E3" w:val="clear"/>
             <w:tcMar>
               <w:top w:type="dxa" w:w="80"/>
               <w:left w:type="dxa" w:w="120"/>
@@ -931,6 +932,7 @@
               <w:bottom w:val="single" w:color="CCCCCC" w:sz="1"/>
               <w:right w:val="single" w:color="CCCCCC" w:sz="1"/>
             </w:tcBorders>
+            <w:shd w:fill="D5F5E3" w:val="clear"/>
             <w:tcMar>
               <w:top w:type="dxa" w:w="80"/>
               <w:left w:type="dxa" w:w="120"/>
@@ -958,21 +960,22 @@
               <w:bottom w:val="single" w:color="CCCCCC" w:sz="1"/>
               <w:right w:val="single" w:color="CCCCCC" w:sz="1"/>
             </w:tcBorders>
-            <w:tcMar>
-              <w:top w:type="dxa" w:w="80"/>
-              <w:left w:type="dxa" w:w="120"/>
-              <w:bottom w:type="dxa" w:w="80"/>
-              <w:right w:type="dxa" w:w="120"/>
-            </w:tcMar>
-          </w:tcPr>
-          <w:p>
-            <w:r>
-              <w:rPr>
-                <w:rFonts w:ascii="Arial" w:cs="Arial" w:eastAsia="Arial" w:hAnsi="Arial"/>
-                <w:sz w:val="20"/>
-                <w:szCs w:val="20"/>
-              </w:rPr>
-              <w:t xml:space="preserve">Valeur par défaut à False, surcharger via .env uniquement en dev</w:t>
+            <w:shd w:fill="D5F5E3" w:val="clear"/>
+            <w:tcMar>
+              <w:top w:type="dxa" w:w="80"/>
+              <w:left w:type="dxa" w:w="120"/>
+              <w:bottom w:type="dxa" w:w="80"/>
+              <w:right w:type="dxa" w:w="120"/>
+            </w:tcMar>
+          </w:tcPr>
+          <w:p>
+            <w:r>
+              <w:rPr>
+                <w:rFonts w:ascii="Arial" w:cs="Arial" w:eastAsia="Arial" w:hAnsi="Arial"/>
+                <w:sz w:val="20"/>
+                <w:szCs w:val="20"/>
+              </w:rPr>
+              <w:t xml:space="preserve">✓ Corrigé : debug: bool = False par défaut, surchargé via .env en dev</w:t>
             </w:r>
           </w:p>
         </w:tc>
@@ -987,7 +990,7 @@
               <w:bottom w:val="single" w:color="CCCCCC" w:sz="1"/>
               <w:right w:val="single" w:color="CCCCCC" w:sz="1"/>
             </w:tcBorders>
-            <w:shd w:fill="FADBD8" w:val="clear"/>
+            <w:shd w:fill="EBF5FB" w:val="clear"/>
             <w:tcMar>
               <w:top w:type="dxa" w:w="80"/>
               <w:left w:type="dxa" w:w="120"/>
@@ -1005,11 +1008,11 @@
                 <w:rFonts w:ascii="Arial" w:cs="Arial" w:eastAsia="Arial" w:hAnsi="Arial"/>
                 <w:b/>
                 <w:bCs/>
-                <w:color w:val="C0392B"/>
+                <w:color w:val="1A5276"/>
                 <w:sz w:val="18"/>
                 <w:szCs w:val="18"/>
               </w:rPr>
-              <w:t xml:space="preserve">CRITIQUE</w:t>
+              <w:t xml:space="preserve">N/A</w:t>
             </w:r>
           </w:p>
         </w:tc>
@@ -1022,6 +1025,7 @@
               <w:bottom w:val="single" w:color="CCCCCC" w:sz="1"/>
               <w:right w:val="single" w:color="CCCCCC" w:sz="1"/>
             </w:tcBorders>
+            <w:shd w:fill="EBF5FB" w:val="clear"/>
             <w:tcMar>
               <w:top w:type="dxa" w:w="80"/>
               <w:left w:type="dxa" w:w="120"/>
@@ -1052,6 +1056,7 @@
               <w:bottom w:val="single" w:color="CCCCCC" w:sz="1"/>
               <w:right w:val="single" w:color="CCCCCC" w:sz="1"/>
             </w:tcBorders>
+            <w:shd w:fill="EBF5FB" w:val="clear"/>
             <w:tcMar>
               <w:top w:type="dxa" w:w="80"/>
               <w:left w:type="dxa" w:w="120"/>
@@ -1079,21 +1084,22 @@
               <w:bottom w:val="single" w:color="CCCCCC" w:sz="1"/>
               <w:right w:val="single" w:color="CCCCCC" w:sz="1"/>
             </w:tcBorders>
-            <w:tcMar>
-              <w:top w:type="dxa" w:w="80"/>
-              <w:left w:type="dxa" w:w="120"/>
-              <w:bottom w:type="dxa" w:w="80"/>
-              <w:right w:type="dxa" w:w="120"/>
-            </w:tcMar>
-          </w:tcPr>
-          <w:p>
-            <w:r>
-              <w:rPr>
-                <w:rFonts w:ascii="Arial" w:cs="Arial" w:eastAsia="Arial" w:hAnsi="Arial"/>
-                <w:sz w:val="20"/>
-                <w:szCs w:val="20"/>
-              </w:rPr>
-              <w:t xml:space="preserve">Activer RLS sur le bucket et utiliser une clé limitée, ou signer les uploads via un service dédié</w:t>
+            <w:shd w:fill="EBF5FB" w:val="clear"/>
+            <w:tcMar>
+              <w:top w:type="dxa" w:w="80"/>
+              <w:left w:type="dxa" w:w="120"/>
+              <w:bottom w:type="dxa" w:w="80"/>
+              <w:right w:type="dxa" w:w="120"/>
+            </w:tcMar>
+          </w:tcPr>
+          <w:p>
+            <w:r>
+              <w:rPr>
+                <w:rFonts w:ascii="Arial" w:cs="Arial" w:eastAsia="Arial" w:hAnsi="Arial"/>
+                <w:sz w:val="20"/>
+                <w:szCs w:val="20"/>
+              </w:rPr>
+              <w:t xml:space="preserve">Non applicable : .env gitignore ✓, clé jamais exposée au client, seul l'admin peut uploader</w:t>
             </w:r>
           </w:p>
         </w:tc>
@@ -1108,7 +1114,7 @@
               <w:bottom w:val="single" w:color="CCCCCC" w:sz="1"/>
               <w:right w:val="single" w:color="CCCCCC" w:sz="1"/>
             </w:tcBorders>
-            <w:shd w:fill="FADBD8" w:val="clear"/>
+            <w:shd w:fill="D5F5E3" w:val="clear"/>
             <w:tcMar>
               <w:top w:type="dxa" w:w="80"/>
               <w:left w:type="dxa" w:w="120"/>
@@ -1126,11 +1132,11 @@
                 <w:rFonts w:ascii="Arial" w:cs="Arial" w:eastAsia="Arial" w:hAnsi="Arial"/>
                 <w:b/>
                 <w:bCs/>
-                <w:color w:val="C0392B"/>
+                <w:color w:val="1E8449"/>
                 <w:sz w:val="18"/>
                 <w:szCs w:val="18"/>
               </w:rPr>
-              <w:t xml:space="preserve">CRITIQUE</w:t>
+              <w:t xml:space="preserve">✓ CORRIGÉ</w:t>
             </w:r>
           </w:p>
         </w:tc>
@@ -1143,6 +1149,7 @@
               <w:bottom w:val="single" w:color="CCCCCC" w:sz="1"/>
               <w:right w:val="single" w:color="CCCCCC" w:sz="1"/>
             </w:tcBorders>
+            <w:shd w:fill="D5F5E3" w:val="clear"/>
             <w:tcMar>
               <w:top w:type="dxa" w:w="80"/>
               <w:left w:type="dxa" w:w="120"/>
@@ -1173,6 +1180,7 @@
               <w:bottom w:val="single" w:color="CCCCCC" w:sz="1"/>
               <w:right w:val="single" w:color="CCCCCC" w:sz="1"/>
             </w:tcBorders>
+            <w:shd w:fill="D5F5E3" w:val="clear"/>
             <w:tcMar>
               <w:top w:type="dxa" w:w="80"/>
               <w:left w:type="dxa" w:w="120"/>
@@ -1200,21 +1208,22 @@
               <w:bottom w:val="single" w:color="CCCCCC" w:sz="1"/>
               <w:right w:val="single" w:color="CCCCCC" w:sz="1"/>
             </w:tcBorders>
-            <w:tcMar>
-              <w:top w:type="dxa" w:w="80"/>
-              <w:left w:type="dxa" w:w="120"/>
-              <w:bottom w:type="dxa" w:w="80"/>
-              <w:right w:type="dxa" w:w="120"/>
-            </w:tcMar>
-          </w:tcPr>
-          <w:p>
-            <w:r>
-              <w:rPr>
-                <w:rFonts w:ascii="Arial" w:cs="Arial" w:eastAsia="Arial" w:hAnsi="Arial"/>
-                <w:sz w:val="20"/>
-                <w:szCs w:val="20"/>
-              </w:rPr>
-              <w:t xml:space="preserve">Ajouter .env.test au .gitignore, utiliser os.urandom(32).hex() pour générer un secret de test</w:t>
+            <w:shd w:fill="D5F5E3" w:val="clear"/>
+            <w:tcMar>
+              <w:top w:type="dxa" w:w="80"/>
+              <w:left w:type="dxa" w:w="120"/>
+              <w:bottom w:type="dxa" w:w="80"/>
+              <w:right w:type="dxa" w:w="120"/>
+            </w:tcMar>
+          </w:tcPr>
+          <w:p>
+            <w:r>
+              <w:rPr>
+                <w:rFonts w:ascii="Arial" w:cs="Arial" w:eastAsia="Arial" w:hAnsi="Arial"/>
+                <w:sz w:val="20"/>
+                <w:szCs w:val="20"/>
+              </w:rPr>
+              <w:t xml:space="preserve">✓ Corrigé : .env.test supprimé (redondant avec conftest.py) et ajouté au .gitignore</w:t>
             </w:r>
           </w:p>
         </w:tc>
@@ -5281,12 +5290,12 @@
       <w:r>
         <w:rPr>
           <w:rFonts w:ascii="Arial" w:cs="Arial" w:eastAsia="Arial" w:hAnsi="Arial"/>
-          <w:b/>
-          <w:bCs/>
+          <w:b w:val="false"/>
+          <w:bCs w:val="false"/>
           <w:sz w:val="22"/>
           <w:szCs w:val="22"/>
         </w:rPr>
-        <w:t xml:space="preserve">Backend : passer debug=False par défaut dans config.py</w:t>
+        <w:t xml:space="preserve">✓ Backend : debug=False par défaut dans config.py — CORRIGÉ</w:t>
       </w:r>
     </w:p>
     <w:p>
@@ -5301,12 +5310,12 @@
       <w:r>
         <w:rPr>
           <w:rFonts w:ascii="Arial" w:cs="Arial" w:eastAsia="Arial" w:hAnsi="Arial"/>
-          <w:b/>
-          <w:bCs/>
+          <w:b w:val="false"/>
+          <w:bCs w:val="false"/>
           <w:sz w:val="22"/>
           <w:szCs w:val="22"/>
         </w:rPr>
-        <w:t xml:space="preserve">Backend : remplacer SUPABASE_SERVICE_ROLE_KEY par une clé limitée avec RLS activé</w:t>
+        <w:t xml:space="preserve">~ Backend : SUPABASE_SERVICE_ROLE_KEY — NON APPLICABLE (.env gitignore, clé jamais exposée au client)</w:t>
       </w:r>
     </w:p>
     <w:p>
@@ -5321,12 +5330,12 @@
       <w:r>
         <w:rPr>
           <w:rFonts w:ascii="Arial" w:cs="Arial" w:eastAsia="Arial" w:hAnsi="Arial"/>
-          <w:b/>
-          <w:bCs/>
+          <w:b w:val="false"/>
+          <w:bCs w:val="false"/>
           <w:sz w:val="22"/>
           <w:szCs w:val="22"/>
         </w:rPr>
-        <w:t xml:space="preserve">Backend : ajouter .env.test au .gitignore et changer la SECRET_KEY de test</w:t>
+        <w:t xml:space="preserve">✓ Backend : .env.test supprimé et ajouté au .gitignore — CORRIGÉ</w:t>
       </w:r>
     </w:p>
     <w:p>

</xml_diff>

<commit_message>
fix(backend): remplace bare except par except Exception dans public_trade_in
</commit_message>
<xml_diff>
--- a/Audit_GLF.docx
+++ b/Audit_GLF.docx
@@ -1481,7 +1481,7 @@
               <w:bottom w:val="single" w:color="CCCCCC" w:sz="1"/>
               <w:right w:val="single" w:color="CCCCCC" w:sz="1"/>
             </w:tcBorders>
-            <w:shd w:fill="FDEBD0" w:val="clear"/>
+            <w:shd w:fill="EBF5FB" w:val="clear"/>
             <w:tcMar>
               <w:top w:type="dxa" w:w="80"/>
               <w:left w:type="dxa" w:w="120"/>
@@ -1499,11 +1499,11 @@
                 <w:rFonts w:ascii="Arial" w:cs="Arial" w:eastAsia="Arial" w:hAnsi="Arial"/>
                 <w:b/>
                 <w:bCs/>
-                <w:color w:val="E67E22"/>
+                <w:color w:val="1A5276"/>
                 <w:sz w:val="18"/>
                 <w:szCs w:val="18"/>
               </w:rPr>
-              <w:t xml:space="preserve">MAJEUR</w:t>
+              <w:t xml:space="preserve">N/A</w:t>
             </w:r>
           </w:p>
         </w:tc>
@@ -1516,6 +1516,7 @@
               <w:bottom w:val="single" w:color="CCCCCC" w:sz="1"/>
               <w:right w:val="single" w:color="CCCCCC" w:sz="1"/>
             </w:tcBorders>
+            <w:shd w:fill="EBF5FB" w:val="clear"/>
             <w:tcMar>
               <w:top w:type="dxa" w:w="80"/>
               <w:left w:type="dxa" w:w="120"/>
@@ -1546,6 +1547,7 @@
               <w:bottom w:val="single" w:color="CCCCCC" w:sz="1"/>
               <w:right w:val="single" w:color="CCCCCC" w:sz="1"/>
             </w:tcBorders>
+            <w:shd w:fill="EBF5FB" w:val="clear"/>
             <w:tcMar>
               <w:top w:type="dxa" w:w="80"/>
               <w:left w:type="dxa" w:w="120"/>
@@ -1573,21 +1575,22 @@
               <w:bottom w:val="single" w:color="CCCCCC" w:sz="1"/>
               <w:right w:val="single" w:color="CCCCCC" w:sz="1"/>
             </w:tcBorders>
-            <w:tcMar>
-              <w:top w:type="dxa" w:w="80"/>
-              <w:left w:type="dxa" w:w="120"/>
-              <w:bottom w:type="dxa" w:w="80"/>
-              <w:right w:type="dxa" w:w="120"/>
-            </w:tcMar>
-          </w:tcPr>
-          <w:p>
-            <w:r>
-              <w:rPr>
-                <w:rFonts w:ascii="Arial" w:cs="Arial" w:eastAsia="Arial" w:hAnsi="Arial"/>
-                <w:sz w:val="20"/>
-                <w:szCs w:val="20"/>
-              </w:rPr>
-              <w:t xml:space="preserve">Retirer role de UserCreate, le fixer à UserRole.ADMIN côté serveur</w:t>
+            <w:shd w:fill="EBF5FB" w:val="clear"/>
+            <w:tcMar>
+              <w:top w:type="dxa" w:w="80"/>
+              <w:left w:type="dxa" w:w="120"/>
+              <w:bottom w:type="dxa" w:w="80"/>
+              <w:right w:type="dxa" w:w="120"/>
+            </w:tcMar>
+          </w:tcPr>
+          <w:p>
+            <w:r>
+              <w:rPr>
+                <w:rFonts w:ascii="Arial" w:cs="Arial" w:eastAsia="Arial" w:hAnsi="Arial"/>
+                <w:sz w:val="20"/>
+                <w:szCs w:val="20"/>
+              </w:rPr>
+              <w:t xml:space="preserve">Non applicable : pas de route API de création d'utilisateur, uniquement un script interne create_admin.py</w:t>
             </w:r>
           </w:p>
         </w:tc>
@@ -1602,7 +1605,7 @@
               <w:bottom w:val="single" w:color="CCCCCC" w:sz="1"/>
               <w:right w:val="single" w:color="CCCCCC" w:sz="1"/>
             </w:tcBorders>
-            <w:shd w:fill="FDEBD0" w:val="clear"/>
+            <w:shd w:fill="D5F5E3" w:val="clear"/>
             <w:tcMar>
               <w:top w:type="dxa" w:w="80"/>
               <w:left w:type="dxa" w:w="120"/>
@@ -1620,11 +1623,11 @@
                 <w:rFonts w:ascii="Arial" w:cs="Arial" w:eastAsia="Arial" w:hAnsi="Arial"/>
                 <w:b/>
                 <w:bCs/>
-                <w:color w:val="E67E22"/>
+                <w:color w:val="1E8449"/>
                 <w:sz w:val="18"/>
                 <w:szCs w:val="18"/>
               </w:rPr>
-              <w:t xml:space="preserve">MAJEUR</w:t>
+              <w:t xml:space="preserve">✓ CORRIGÉ</w:t>
             </w:r>
           </w:p>
         </w:tc>
@@ -1637,6 +1640,7 @@
               <w:bottom w:val="single" w:color="CCCCCC" w:sz="1"/>
               <w:right w:val="single" w:color="CCCCCC" w:sz="1"/>
             </w:tcBorders>
+            <w:shd w:fill="D5F5E3" w:val="clear"/>
             <w:tcMar>
               <w:top w:type="dxa" w:w="80"/>
               <w:left w:type="dxa" w:w="120"/>
@@ -1667,6 +1671,7 @@
               <w:bottom w:val="single" w:color="CCCCCC" w:sz="1"/>
               <w:right w:val="single" w:color="CCCCCC" w:sz="1"/>
             </w:tcBorders>
+            <w:shd w:fill="D5F5E3" w:val="clear"/>
             <w:tcMar>
               <w:top w:type="dxa" w:w="80"/>
               <w:left w:type="dxa" w:w="120"/>
@@ -1694,21 +1699,22 @@
               <w:bottom w:val="single" w:color="CCCCCC" w:sz="1"/>
               <w:right w:val="single" w:color="CCCCCC" w:sz="1"/>
             </w:tcBorders>
-            <w:tcMar>
-              <w:top w:type="dxa" w:w="80"/>
-              <w:left w:type="dxa" w:w="120"/>
-              <w:bottom w:type="dxa" w:w="80"/>
-              <w:right w:type="dxa" w:w="120"/>
-            </w:tcMar>
-          </w:tcPr>
-          <w:p>
-            <w:r>
-              <w:rPr>
-                <w:rFonts w:ascii="Arial" w:cs="Arial" w:eastAsia="Arial" w:hAnsi="Arial"/>
-                <w:sz w:val="20"/>
-                <w:szCs w:val="20"/>
-              </w:rPr>
-              <w:t xml:space="preserve">Remplacer par except Exception as e: et logger.exception(e)</w:t>
+            <w:shd w:fill="D5F5E3" w:val="clear"/>
+            <w:tcMar>
+              <w:top w:type="dxa" w:w="80"/>
+              <w:left w:type="dxa" w:w="120"/>
+              <w:bottom w:type="dxa" w:w="80"/>
+              <w:right w:type="dxa" w:w="120"/>
+            </w:tcMar>
+          </w:tcPr>
+          <w:p>
+            <w:r>
+              <w:rPr>
+                <w:rFonts w:ascii="Arial" w:cs="Arial" w:eastAsia="Arial" w:hAnsi="Arial"/>
+                <w:sz w:val="20"/>
+                <w:szCs w:val="20"/>
+              </w:rPr>
+              <w:t xml:space="preserve">✓ Corrigé : remplacé par except Exception:</w:t>
             </w:r>
           </w:p>
         </w:tc>
@@ -4212,7 +4218,7 @@
               <w:bottom w:val="single" w:color="CCCCCC" w:sz="1"/>
               <w:right w:val="single" w:color="CCCCCC" w:sz="1"/>
             </w:tcBorders>
-            <w:shd w:fill="FADBD8" w:val="clear"/>
+            <w:shd w:fill="D5F5E3" w:val="clear"/>
             <w:tcMar>
               <w:top w:type="dxa" w:w="80"/>
               <w:left w:type="dxa" w:w="120"/>
@@ -4230,11 +4236,11 @@
                 <w:rFonts w:ascii="Arial" w:cs="Arial" w:eastAsia="Arial" w:hAnsi="Arial"/>
                 <w:b/>
                 <w:bCs/>
-                <w:color w:val="C0392B"/>
+                <w:color w:val="1E8449"/>
                 <w:sz w:val="18"/>
                 <w:szCs w:val="18"/>
               </w:rPr>
-              <w:t xml:space="preserve">CRITIQUE</w:t>
+              <w:t xml:space="preserve">✓ CORRIGÉ</w:t>
             </w:r>
           </w:p>
         </w:tc>
@@ -4247,6 +4253,7 @@
               <w:bottom w:val="single" w:color="CCCCCC" w:sz="1"/>
               <w:right w:val="single" w:color="CCCCCC" w:sz="1"/>
             </w:tcBorders>
+            <w:shd w:fill="D5F5E3" w:val="clear"/>
             <w:tcMar>
               <w:top w:type="dxa" w:w="80"/>
               <w:left w:type="dxa" w:w="120"/>
@@ -4277,6 +4284,7 @@
               <w:bottom w:val="single" w:color="CCCCCC" w:sz="1"/>
               <w:right w:val="single" w:color="CCCCCC" w:sz="1"/>
             </w:tcBorders>
+            <w:shd w:fill="D5F5E3" w:val="clear"/>
             <w:tcMar>
               <w:top w:type="dxa" w:w="80"/>
               <w:left w:type="dxa" w:w="120"/>
@@ -4304,21 +4312,22 @@
               <w:bottom w:val="single" w:color="CCCCCC" w:sz="1"/>
               <w:right w:val="single" w:color="CCCCCC" w:sz="1"/>
             </w:tcBorders>
-            <w:tcMar>
-              <w:top w:type="dxa" w:w="80"/>
-              <w:left w:type="dxa" w:w="120"/>
-              <w:bottom w:type="dxa" w:w="80"/>
-              <w:right w:type="dxa" w:w="120"/>
-            </w:tcMar>
-          </w:tcPr>
-          <w:p>
-            <w:r>
-              <w:rPr>
-                <w:rFonts w:ascii="Arial" w:cs="Arial" w:eastAsia="Arial" w:hAnsi="Arial"/>
-                <w:sz w:val="20"/>
-                <w:szCs w:val="20"/>
-              </w:rPr>
-              <w:t xml:space="preserve">Stocker le JWT dans un cookie httpOnly via un endpoint Next.js (/api/auth) et passer les requêtes côté serveur</w:t>
+            <w:shd w:fill="D5F5E3" w:val="clear"/>
+            <w:tcMar>
+              <w:top w:type="dxa" w:w="80"/>
+              <w:left w:type="dxa" w:w="120"/>
+              <w:bottom w:type="dxa" w:w="80"/>
+              <w:right w:type="dxa" w:w="120"/>
+            </w:tcMar>
+          </w:tcPr>
+          <w:p>
+            <w:r>
+              <w:rPr>
+                <w:rFonts w:ascii="Arial" w:cs="Arial" w:eastAsia="Arial" w:hAnsi="Arial"/>
+                <w:sz w:val="20"/>
+                <w:szCs w:val="20"/>
+              </w:rPr>
+              <w:t xml:space="preserve">✓ Corrigé : cookie httpOnly via /api/auth/login, middleware Next.js, token en mémoire React</w:t>
             </w:r>
           </w:p>
         </w:tc>
@@ -4333,7 +4342,7 @@
               <w:bottom w:val="single" w:color="CCCCCC" w:sz="1"/>
               <w:right w:val="single" w:color="CCCCCC" w:sz="1"/>
             </w:tcBorders>
-            <w:shd w:fill="FDEBD0" w:val="clear"/>
+            <w:shd w:fill="D5F5E3" w:val="clear"/>
             <w:tcMar>
               <w:top w:type="dxa" w:w="80"/>
               <w:left w:type="dxa" w:w="120"/>
@@ -4351,11 +4360,11 @@
                 <w:rFonts w:ascii="Arial" w:cs="Arial" w:eastAsia="Arial" w:hAnsi="Arial"/>
                 <w:b/>
                 <w:bCs/>
-                <w:color w:val="E67E22"/>
+                <w:color w:val="1E8449"/>
                 <w:sz w:val="18"/>
                 <w:szCs w:val="18"/>
               </w:rPr>
-              <w:t xml:space="preserve">MAJEUR</w:t>
+              <w:t xml:space="preserve">✓ CORRIGÉ</w:t>
             </w:r>
           </w:p>
         </w:tc>
@@ -4368,6 +4377,7 @@
               <w:bottom w:val="single" w:color="CCCCCC" w:sz="1"/>
               <w:right w:val="single" w:color="CCCCCC" w:sz="1"/>
             </w:tcBorders>
+            <w:shd w:fill="D5F5E3" w:val="clear"/>
             <w:tcMar>
               <w:top w:type="dxa" w:w="80"/>
               <w:left w:type="dxa" w:w="120"/>
@@ -4399,6 +4409,7 @@
               <w:bottom w:val="single" w:color="CCCCCC" w:sz="1"/>
               <w:right w:val="single" w:color="CCCCCC" w:sz="1"/>
             </w:tcBorders>
+            <w:shd w:fill="D5F5E3" w:val="clear"/>
             <w:tcMar>
               <w:top w:type="dxa" w:w="80"/>
               <w:left w:type="dxa" w:w="120"/>
@@ -4426,21 +4437,22 @@
               <w:bottom w:val="single" w:color="CCCCCC" w:sz="1"/>
               <w:right w:val="single" w:color="CCCCCC" w:sz="1"/>
             </w:tcBorders>
-            <w:tcMar>
-              <w:top w:type="dxa" w:w="80"/>
-              <w:left w:type="dxa" w:w="120"/>
-              <w:bottom w:type="dxa" w:w="80"/>
-              <w:right w:type="dxa" w:w="120"/>
-            </w:tcMar>
-          </w:tcPr>
-          <w:p>
-            <w:r>
-              <w:rPr>
-                <w:rFonts w:ascii="Arial" w:cs="Arial" w:eastAsia="Arial" w:hAnsi="Arial"/>
-                <w:sz w:val="20"/>
-                <w:szCs w:val="20"/>
-              </w:rPr>
-              <w:t xml:space="preserve">Corriger en &lt;a href={...}&gt;</w:t>
+            <w:shd w:fill="D5F5E3" w:val="clear"/>
+            <w:tcMar>
+              <w:top w:type="dxa" w:w="80"/>
+              <w:left w:type="dxa" w:w="120"/>
+              <w:bottom w:type="dxa" w:w="80"/>
+              <w:right w:type="dxa" w:w="120"/>
+            </w:tcMar>
+          </w:tcPr>
+          <w:p>
+            <w:r>
+              <w:rPr>
+                <w:rFonts w:ascii="Arial" w:cs="Arial" w:eastAsia="Arial" w:hAnsi="Arial"/>
+                <w:sz w:val="20"/>
+                <w:szCs w:val="20"/>
+              </w:rPr>
+              <w:t xml:space="preserve">✓ Corrigé : balise remplacée par &lt;a href={...}&gt;</w:t>
             </w:r>
           </w:p>
         </w:tc>
@@ -5350,12 +5362,12 @@
       <w:r>
         <w:rPr>
           <w:rFonts w:ascii="Arial" w:cs="Arial" w:eastAsia="Arial" w:hAnsi="Arial"/>
-          <w:b/>
-          <w:bCs/>
+          <w:b w:val="false"/>
+          <w:bCs w:val="false"/>
           <w:sz w:val="22"/>
           <w:szCs w:val="22"/>
         </w:rPr>
-        <w:t xml:space="preserve">Frontend : corriger le bug &lt;a a href=...&gt; ligne 147 de vehicules/[id]/page.js</w:t>
+        <w:t xml:space="preserve">✓ Frontend : bug &lt;a a href=...&gt; ligne 147 corrigé — CORRIGÉ</w:t>
       </w:r>
     </w:p>
     <w:p>
@@ -5370,12 +5382,12 @@
       <w:r>
         <w:rPr>
           <w:rFonts w:ascii="Arial" w:cs="Arial" w:eastAsia="Arial" w:hAnsi="Arial"/>
-          <w:b/>
-          <w:bCs/>
+          <w:b w:val="false"/>
+          <w:bCs w:val="false"/>
           <w:sz w:val="22"/>
           <w:szCs w:val="22"/>
         </w:rPr>
-        <w:t xml:space="preserve">Frontend : migrer le JWT vers un cookie httpOnly (endpoint Next.js /api/auth)</w:t>
+        <w:t xml:space="preserve">✓ Frontend : JWT migré vers cookie httpOnly — CORRIGÉ</w:t>
       </w:r>
     </w:p>
     <w:p>
@@ -5415,7 +5427,7 @@
           <w:sz w:val="22"/>
           <w:szCs w:val="22"/>
         </w:rPr>
-        <w:t xml:space="preserve">Backend : retirer role de UserCreate</w:t>
+        <w:t xml:space="preserve">~ Backend : role dans UserCreate — NON APPLICABLE (pas de route API de création)</w:t>
       </w:r>
     </w:p>
     <w:p>
@@ -5435,7 +5447,7 @@
           <w:sz w:val="22"/>
           <w:szCs w:val="22"/>
         </w:rPr>
-        <w:t xml:space="preserve">Backend : corriger le bare except dans public_trade_in.py</w:t>
+        <w:t xml:space="preserve">✓ Backend : bare except corrigé en except Exception: — CORRIGÉ</w:t>
       </w:r>
     </w:p>
     <w:p>

</xml_diff>

<commit_message>
feat(backend): valide les magic bytes des images uploadées
</commit_message>
<xml_diff>
--- a/Audit_GLF.docx
+++ b/Audit_GLF.docx
@@ -1238,7 +1238,7 @@
               <w:bottom w:val="single" w:color="CCCCCC" w:sz="1"/>
               <w:right w:val="single" w:color="CCCCCC" w:sz="1"/>
             </w:tcBorders>
-            <w:shd w:fill="FDEBD0" w:val="clear"/>
+            <w:shd w:fill="D5F5E3" w:val="clear"/>
             <w:tcMar>
               <w:top w:type="dxa" w:w="80"/>
               <w:left w:type="dxa" w:w="120"/>
@@ -1256,11 +1256,11 @@
                 <w:rFonts w:ascii="Arial" w:cs="Arial" w:eastAsia="Arial" w:hAnsi="Arial"/>
                 <w:b/>
                 <w:bCs/>
-                <w:color w:val="E67E22"/>
+                <w:color w:val="1E8449"/>
                 <w:sz w:val="18"/>
                 <w:szCs w:val="18"/>
               </w:rPr>
-              <w:t xml:space="preserve">MAJEUR</w:t>
+              <w:t xml:space="preserve">✓ CORRIGÉ</w:t>
             </w:r>
           </w:p>
         </w:tc>
@@ -1273,6 +1273,7 @@
               <w:bottom w:val="single" w:color="CCCCCC" w:sz="1"/>
               <w:right w:val="single" w:color="CCCCCC" w:sz="1"/>
             </w:tcBorders>
+            <w:shd w:fill="D5F5E3" w:val="clear"/>
             <w:tcMar>
               <w:top w:type="dxa" w:w="80"/>
               <w:left w:type="dxa" w:w="120"/>
@@ -1304,6 +1305,7 @@
               <w:bottom w:val="single" w:color="CCCCCC" w:sz="1"/>
               <w:right w:val="single" w:color="CCCCCC" w:sz="1"/>
             </w:tcBorders>
+            <w:shd w:fill="D5F5E3" w:val="clear"/>
             <w:tcMar>
               <w:top w:type="dxa" w:w="80"/>
               <w:left w:type="dxa" w:w="120"/>
@@ -1331,21 +1333,22 @@
               <w:bottom w:val="single" w:color="CCCCCC" w:sz="1"/>
               <w:right w:val="single" w:color="CCCCCC" w:sz="1"/>
             </w:tcBorders>
-            <w:tcMar>
-              <w:top w:type="dxa" w:w="80"/>
-              <w:left w:type="dxa" w:w="120"/>
-              <w:bottom w:type="dxa" w:w="80"/>
-              <w:right w:type="dxa" w:w="120"/>
-            </w:tcMar>
-          </w:tcPr>
-          <w:p>
-            <w:r>
-              <w:rPr>
-                <w:rFonts w:ascii="Arial" w:cs="Arial" w:eastAsia="Arial" w:hAnsi="Arial"/>
-                <w:sz w:val="20"/>
-                <w:szCs w:val="20"/>
-              </w:rPr>
-              <w:t xml:space="preserve">Ajouter slowapi : @limiter.limit('5/minute') sur les routes POST</w:t>
+            <w:shd w:fill="D5F5E3" w:val="clear"/>
+            <w:tcMar>
+              <w:top w:type="dxa" w:w="80"/>
+              <w:left w:type="dxa" w:w="120"/>
+              <w:bottom w:type="dxa" w:w="80"/>
+              <w:right w:type="dxa" w:w="120"/>
+            </w:tcMar>
+          </w:tcPr>
+          <w:p>
+            <w:r>
+              <w:rPr>
+                <w:rFonts w:ascii="Arial" w:cs="Arial" w:eastAsia="Arial" w:hAnsi="Arial"/>
+                <w:sz w:val="20"/>
+                <w:szCs w:val="20"/>
+              </w:rPr>
+              <w:t xml:space="preserve">✓ Corrigé : slowapi installé, @limiter.limit('5/minute') sur les deux routes</w:t>
             </w:r>
           </w:p>
         </w:tc>
@@ -5467,7 +5470,7 @@
           <w:sz w:val="22"/>
           <w:szCs w:val="22"/>
         </w:rPr>
-        <w:t xml:space="preserve">Backend : ajouter slowapi pour le rate limiting sur /contact et /trade-in</w:t>
+        <w:t xml:space="preserve">✓ Backend : slowapi ajouté, rate limiting 5/minute sur /contact et /trade-in — CORRIGÉ</w:t>
       </w:r>
     </w:p>
     <w:p>

</xml_diff>

<commit_message>
fix(backend): restreint les méthodes et headers CORS autorisés
</commit_message>
<xml_diff>
--- a/Audit_GLF.docx
+++ b/Audit_GLF.docx
@@ -1363,7 +1363,7 @@
               <w:bottom w:val="single" w:color="CCCCCC" w:sz="1"/>
               <w:right w:val="single" w:color="CCCCCC" w:sz="1"/>
             </w:tcBorders>
-            <w:shd w:fill="FDEBD0" w:val="clear"/>
+            <w:shd w:fill="D5F5E3" w:val="clear"/>
             <w:tcMar>
               <w:top w:type="dxa" w:w="80"/>
               <w:left w:type="dxa" w:w="120"/>
@@ -1381,11 +1381,11 @@
                 <w:rFonts w:ascii="Arial" w:cs="Arial" w:eastAsia="Arial" w:hAnsi="Arial"/>
                 <w:b/>
                 <w:bCs/>
-                <w:color w:val="E67E22"/>
+                <w:color w:val="1E8449"/>
                 <w:sz w:val="18"/>
                 <w:szCs w:val="18"/>
               </w:rPr>
-              <w:t xml:space="preserve">MAJEUR</w:t>
+              <w:t xml:space="preserve">✓ CORRIGÉ</w:t>
             </w:r>
           </w:p>
         </w:tc>
@@ -1398,6 +1398,7 @@
               <w:bottom w:val="single" w:color="CCCCCC" w:sz="1"/>
               <w:right w:val="single" w:color="CCCCCC" w:sz="1"/>
             </w:tcBorders>
+            <w:shd w:fill="D5F5E3" w:val="clear"/>
             <w:tcMar>
               <w:top w:type="dxa" w:w="80"/>
               <w:left w:type="dxa" w:w="120"/>
@@ -1428,6 +1429,7 @@
               <w:bottom w:val="single" w:color="CCCCCC" w:sz="1"/>
               <w:right w:val="single" w:color="CCCCCC" w:sz="1"/>
             </w:tcBorders>
+            <w:shd w:fill="D5F5E3" w:val="clear"/>
             <w:tcMar>
               <w:top w:type="dxa" w:w="80"/>
               <w:left w:type="dxa" w:w="120"/>
@@ -1455,21 +1457,22 @@
               <w:bottom w:val="single" w:color="CCCCCC" w:sz="1"/>
               <w:right w:val="single" w:color="CCCCCC" w:sz="1"/>
             </w:tcBorders>
-            <w:tcMar>
-              <w:top w:type="dxa" w:w="80"/>
-              <w:left w:type="dxa" w:w="120"/>
-              <w:bottom w:type="dxa" w:w="80"/>
-              <w:right w:type="dxa" w:w="120"/>
-            </w:tcMar>
-          </w:tcPr>
-          <w:p>
-            <w:r>
-              <w:rPr>
-                <w:rFonts w:ascii="Arial" w:cs="Arial" w:eastAsia="Arial" w:hAnsi="Arial"/>
-                <w:sz w:val="20"/>
-                <w:szCs w:val="20"/>
-              </w:rPr>
-              <w:t xml:space="preserve">Vérifier les magic bytes avec python-magic et limiter la taille du fichier (ex. 5 Mo max)</w:t>
+            <w:shd w:fill="D5F5E3" w:val="clear"/>
+            <w:tcMar>
+              <w:top w:type="dxa" w:w="80"/>
+              <w:left w:type="dxa" w:w="120"/>
+              <w:bottom w:type="dxa" w:w="80"/>
+              <w:right w:type="dxa" w:w="120"/>
+            </w:tcMar>
+          </w:tcPr>
+          <w:p>
+            <w:r>
+              <w:rPr>
+                <w:rFonts w:ascii="Arial" w:cs="Arial" w:eastAsia="Arial" w:hAnsi="Arial"/>
+                <w:sz w:val="20"/>
+                <w:szCs w:val="20"/>
+              </w:rPr>
+              <w:t xml:space="preserve">✓ Corrigé : python-magic valide les vrais octets du fichier avant upload (taille limitée à 2 Mo par Supabase)</w:t>
             </w:r>
           </w:p>
         </w:tc>
@@ -4470,7 +4473,7 @@
               <w:bottom w:val="single" w:color="CCCCCC" w:sz="1"/>
               <w:right w:val="single" w:color="CCCCCC" w:sz="1"/>
             </w:tcBorders>
-            <w:shd w:fill="FDEBD0" w:val="clear"/>
+            <w:shd w:fill="D5F5E3" w:val="clear"/>
             <w:tcMar>
               <w:top w:type="dxa" w:w="80"/>
               <w:left w:type="dxa" w:w="120"/>
@@ -4488,11 +4491,11 @@
                 <w:rFonts w:ascii="Arial" w:cs="Arial" w:eastAsia="Arial" w:hAnsi="Arial"/>
                 <w:b/>
                 <w:bCs/>
-                <w:color w:val="E67E22"/>
+                <w:color w:val="1E8449"/>
                 <w:sz w:val="18"/>
                 <w:szCs w:val="18"/>
               </w:rPr>
-              <w:t xml:space="preserve">MAJEUR</w:t>
+              <w:t xml:space="preserve">✓ CORRIGÉ</w:t>
             </w:r>
           </w:p>
         </w:tc>
@@ -4505,6 +4508,7 @@
               <w:bottom w:val="single" w:color="CCCCCC" w:sz="1"/>
               <w:right w:val="single" w:color="CCCCCC" w:sz="1"/>
             </w:tcBorders>
+            <w:shd w:fill="D5F5E3" w:val="clear"/>
             <w:tcMar>
               <w:top w:type="dxa" w:w="80"/>
               <w:left w:type="dxa" w:w="120"/>
@@ -4535,6 +4539,7 @@
               <w:bottom w:val="single" w:color="CCCCCC" w:sz="1"/>
               <w:right w:val="single" w:color="CCCCCC" w:sz="1"/>
             </w:tcBorders>
+            <w:shd w:fill="D5F5E3" w:val="clear"/>
             <w:tcMar>
               <w:top w:type="dxa" w:w="80"/>
               <w:left w:type="dxa" w:w="120"/>
@@ -4562,21 +4567,22 @@
               <w:bottom w:val="single" w:color="CCCCCC" w:sz="1"/>
               <w:right w:val="single" w:color="CCCCCC" w:sz="1"/>
             </w:tcBorders>
-            <w:tcMar>
-              <w:top w:type="dxa" w:w="80"/>
-              <w:left w:type="dxa" w:w="120"/>
-              <w:bottom w:type="dxa" w:w="80"/>
-              <w:right w:type="dxa" w:w="120"/>
-            </w:tcMar>
-          </w:tcPr>
-          <w:p>
-            <w:r>
-              <w:rPr>
-                <w:rFonts w:ascii="Arial" w:cs="Arial" w:eastAsia="Arial" w:hAnsi="Arial"/>
-                <w:sz w:val="20"/>
-                <w:szCs w:val="20"/>
-              </w:rPr>
-              <w:t xml:space="preserve">Ajouter un middleware Next.js (middleware.js) qui vérifie le cookie JWT avant le rendu de toute route /admin/*</w:t>
+            <w:shd w:fill="D5F5E3" w:val="clear"/>
+            <w:tcMar>
+              <w:top w:type="dxa" w:w="80"/>
+              <w:left w:type="dxa" w:w="120"/>
+              <w:bottom w:type="dxa" w:w="80"/>
+              <w:right w:type="dxa" w:w="120"/>
+            </w:tcMar>
+          </w:tcPr>
+          <w:p>
+            <w:r>
+              <w:rPr>
+                <w:rFonts w:ascii="Arial" w:cs="Arial" w:eastAsia="Arial" w:hAnsi="Arial"/>
+                <w:sz w:val="20"/>
+                <w:szCs w:val="20"/>
+              </w:rPr>
+              <w:t xml:space="preserve">✓ Corrigé : middleware.js vérifie le cookie glf_admin_token avant le rendu de toute route /admin/* (hors /admin/login)</w:t>
             </w:r>
           </w:p>
         </w:tc>
@@ -5490,7 +5496,7 @@
           <w:sz w:val="22"/>
           <w:szCs w:val="22"/>
         </w:rPr>
-        <w:t xml:space="preserve">Backend : valider les magic bytes des images uploadées</w:t>
+        <w:t xml:space="preserve">✓ Backend : magic bytes validés avec python-magic avant upload — CORRIGÉ</w:t>
       </w:r>
     </w:p>
     <w:p>
@@ -5510,7 +5516,7 @@
           <w:sz w:val="22"/>
           <w:szCs w:val="22"/>
         </w:rPr>
-        <w:t xml:space="preserve">Frontend : ajouter un middleware Next.js pour la protection des routes /admin/*</w:t>
+        <w:t xml:space="preserve">✓ Frontend : middleware Next.js ajouté pour la protection des routes /admin/* — CORRIGÉ</w:t>
       </w:r>
     </w:p>
     <w:p>

</xml_diff>

<commit_message>
fix(backend): déplace le limiter dans app/core/limiter.py pour éviter l'import circulaire
</commit_message>
<xml_diff>
--- a/Audit_GLF.docx
+++ b/Audit_GLF.docx
@@ -4597,7 +4597,7 @@
               <w:bottom w:val="single" w:color="CCCCCC" w:sz="1"/>
               <w:right w:val="single" w:color="CCCCCC" w:sz="1"/>
             </w:tcBorders>
-            <w:shd w:fill="FDEBD0" w:val="clear"/>
+            <w:shd w:fill="D5F5E3" w:val="clear"/>
             <w:tcMar>
               <w:top w:type="dxa" w:w="80"/>
               <w:left w:type="dxa" w:w="120"/>
@@ -4615,11 +4615,11 @@
                 <w:rFonts w:ascii="Arial" w:cs="Arial" w:eastAsia="Arial" w:hAnsi="Arial"/>
                 <w:b/>
                 <w:bCs/>
-                <w:color w:val="E67E22"/>
+                <w:color w:val="1E8449"/>
                 <w:sz w:val="18"/>
                 <w:szCs w:val="18"/>
               </w:rPr>
-              <w:t xml:space="preserve">MAJEUR</w:t>
+              <w:t xml:space="preserve">✓ CORRIGÉ</w:t>
             </w:r>
           </w:p>
         </w:tc>
@@ -4632,6 +4632,7 @@
               <w:bottom w:val="single" w:color="CCCCCC" w:sz="1"/>
               <w:right w:val="single" w:color="CCCCCC" w:sz="1"/>
             </w:tcBorders>
+            <w:shd w:fill="D5F5E3" w:val="clear"/>
             <w:tcMar>
               <w:top w:type="dxa" w:w="80"/>
               <w:left w:type="dxa" w:w="120"/>
@@ -4663,6 +4664,7 @@
               <w:bottom w:val="single" w:color="CCCCCC" w:sz="1"/>
               <w:right w:val="single" w:color="CCCCCC" w:sz="1"/>
             </w:tcBorders>
+            <w:shd w:fill="D5F5E3" w:val="clear"/>
             <w:tcMar>
               <w:top w:type="dxa" w:w="80"/>
               <w:left w:type="dxa" w:w="120"/>
@@ -4690,21 +4692,22 @@
               <w:bottom w:val="single" w:color="CCCCCC" w:sz="1"/>
               <w:right w:val="single" w:color="CCCCCC" w:sz="1"/>
             </w:tcBorders>
-            <w:tcMar>
-              <w:top w:type="dxa" w:w="80"/>
-              <w:left w:type="dxa" w:w="120"/>
-              <w:bottom w:type="dxa" w:w="80"/>
-              <w:right w:type="dxa" w:w="120"/>
-            </w:tcMar>
-          </w:tcPr>
-          <w:p>
-            <w:r>
-              <w:rPr>
-                <w:rFonts w:ascii="Arial" w:cs="Arial" w:eastAsia="Arial" w:hAnsi="Arial"/>
-                <w:sz w:val="20"/>
-                <w:szCs w:val="20"/>
-              </w:rPr>
-              <w:t xml:space="preserve">Extraire dans src/app/utils/constants.js et importer depuis les deux pages</w:t>
+            <w:shd w:fill="D5F5E3" w:val="clear"/>
+            <w:tcMar>
+              <w:top w:type="dxa" w:w="80"/>
+              <w:left w:type="dxa" w:w="120"/>
+              <w:bottom w:type="dxa" w:w="80"/>
+              <w:right w:type="dxa" w:w="120"/>
+            </w:tcMar>
+          </w:tcPr>
+          <w:p>
+            <w:r>
+              <w:rPr>
+                <w:rFonts w:ascii="Arial" w:cs="Arial" w:eastAsia="Arial" w:hAnsi="Arial"/>
+                <w:sz w:val="20"/>
+                <w:szCs w:val="20"/>
+              </w:rPr>
+              <w:t xml:space="preserve">✓ Corrigé : centralisés dans src/app/utils/constants.js, importés depuis les deux pages</w:t>
             </w:r>
           </w:p>
         </w:tc>
@@ -4841,7 +4844,7 @@
               <w:bottom w:val="single" w:color="CCCCCC" w:sz="1"/>
               <w:right w:val="single" w:color="CCCCCC" w:sz="1"/>
             </w:tcBorders>
-            <w:shd w:fill="D6EAF8" w:val="clear"/>
+            <w:shd w:fill="D5F5E3" w:val="clear"/>
             <w:tcMar>
               <w:top w:type="dxa" w:w="80"/>
               <w:left w:type="dxa" w:w="120"/>
@@ -4859,11 +4862,11 @@
                 <w:rFonts w:ascii="Arial" w:cs="Arial" w:eastAsia="Arial" w:hAnsi="Arial"/>
                 <w:b/>
                 <w:bCs/>
-                <w:color w:val="2980B9"/>
+                <w:color w:val="1E8449"/>
                 <w:sz w:val="18"/>
                 <w:szCs w:val="18"/>
               </w:rPr>
-              <w:t xml:space="preserve">MINEUR</w:t>
+              <w:t xml:space="preserve">✓ CORRIGÉ</w:t>
             </w:r>
           </w:p>
         </w:tc>
@@ -4876,6 +4879,7 @@
               <w:bottom w:val="single" w:color="CCCCCC" w:sz="1"/>
               <w:right w:val="single" w:color="CCCCCC" w:sz="1"/>
             </w:tcBorders>
+            <w:shd w:fill="D5F5E3" w:val="clear"/>
             <w:tcMar>
               <w:top w:type="dxa" w:w="80"/>
               <w:left w:type="dxa" w:w="120"/>
@@ -4894,7 +4898,9 @@
                 <w:szCs w:val="20"/>
               </w:rPr>
               <w:t xml:space="preserve">vehicules/page.js
-composants divers</w:t>
+pieces/page.js
+ImageLightBox.js
+admin/**/page.js</w:t>
             </w:r>
           </w:p>
         </w:tc>
@@ -4907,6 +4913,7 @@
               <w:bottom w:val="single" w:color="CCCCCC" w:sz="1"/>
               <w:right w:val="single" w:color="CCCCCC" w:sz="1"/>
             </w:tcBorders>
+            <w:shd w:fill="D5F5E3" w:val="clear"/>
             <w:tcMar>
               <w:top w:type="dxa" w:w="80"/>
               <w:left w:type="dxa" w:w="120"/>
@@ -4934,21 +4941,22 @@
               <w:bottom w:val="single" w:color="CCCCCC" w:sz="1"/>
               <w:right w:val="single" w:color="CCCCCC" w:sz="1"/>
             </w:tcBorders>
-            <w:tcMar>
-              <w:top w:type="dxa" w:w="80"/>
-              <w:left w:type="dxa" w:w="120"/>
-              <w:bottom w:type="dxa" w:w="80"/>
-              <w:right w:type="dxa" w:w="120"/>
-            </w:tcMar>
-          </w:tcPr>
-          <w:p>
-            <w:r>
-              <w:rPr>
-                <w:rFonts w:ascii="Arial" w:cs="Arial" w:eastAsia="Arial" w:hAnsi="Arial"/>
-                <w:sz w:val="20"/>
-                <w:szCs w:val="20"/>
-              </w:rPr>
-              <w:t xml:space="preserve">Remplacer par &lt;Image&gt; de next/image + configurer images.remotePatterns dans next.config.mjs pour Supabase</w:t>
+            <w:shd w:fill="D5F5E3" w:val="clear"/>
+            <w:tcMar>
+              <w:top w:type="dxa" w:w="80"/>
+              <w:left w:type="dxa" w:w="120"/>
+              <w:bottom w:type="dxa" w:w="80"/>
+              <w:right w:type="dxa" w:w="120"/>
+            </w:tcMar>
+          </w:tcPr>
+          <w:p>
+            <w:r>
+              <w:rPr>
+                <w:rFonts w:ascii="Arial" w:cs="Arial" w:eastAsia="Arial" w:hAnsi="Arial"/>
+                <w:sz w:val="20"/>
+                <w:szCs w:val="20"/>
+              </w:rPr>
+              <w:t xml:space="preserve">✓ Corrigé : &lt;Image&gt; de next/image partout + remotePatterns Supabase dans next.config.mjs</w:t>
             </w:r>
           </w:p>
         </w:tc>
@@ -5536,7 +5544,7 @@
           <w:sz w:val="22"/>
           <w:szCs w:val="22"/>
         </w:rPr>
-        <w:t xml:space="preserve">Frontend : extraire FUEL_LABELS/TRANSMISSION_LABELS dans constants.js</w:t>
+        <w:t xml:space="preserve">✓ Frontend : FUEL_LABELS/TRANSMISSION_LABELS centralisés dans utils/constants.js — CORRIGÉ</w:t>
       </w:r>
     </w:p>
     <w:p>
@@ -5556,7 +5564,7 @@
           <w:sz w:val="22"/>
           <w:szCs w:val="22"/>
         </w:rPr>
-        <w:t xml:space="preserve">Frontend : remplacer &lt;img&gt; par next/image + configurer remotePatterns Supabase</w:t>
+        <w:t xml:space="preserve">✓ Frontend : &lt;img&gt; remplacé par next/image + remotePatterns Supabase configurés — CORRIGÉ</w:t>
       </w:r>
     </w:p>
     <w:p>

</xml_diff>

<commit_message>
feat(backend): mise en place d'Alembic pour les migrations de schéma
</commit_message>
<xml_diff>
--- a/Audit_GLF.docx
+++ b/Audit_GLF.docx
@@ -1735,7 +1735,7 @@
               <w:bottom w:val="single" w:color="CCCCCC" w:sz="1"/>
               <w:right w:val="single" w:color="CCCCCC" w:sz="1"/>
             </w:tcBorders>
-            <w:shd w:fill="D6EAF8" w:val="clear"/>
+            <w:shd w:fill="D5F5E3" w:val="clear"/>
             <w:tcMar>
               <w:top w:type="dxa" w:w="80"/>
               <w:left w:type="dxa" w:w="120"/>
@@ -1753,11 +1753,11 @@
                 <w:rFonts w:ascii="Arial" w:cs="Arial" w:eastAsia="Arial" w:hAnsi="Arial"/>
                 <w:b/>
                 <w:bCs/>
-                <w:color w:val="2980B9"/>
+                <w:color w:val="1E8449"/>
                 <w:sz w:val="18"/>
                 <w:szCs w:val="18"/>
               </w:rPr>
-              <w:t xml:space="preserve">MINEUR</w:t>
+              <w:t xml:space="preserve">✓ CORRIGÉ</w:t>
             </w:r>
           </w:p>
         </w:tc>
@@ -1770,6 +1770,7 @@
               <w:bottom w:val="single" w:color="CCCCCC" w:sz="1"/>
               <w:right w:val="single" w:color="CCCCCC" w:sz="1"/>
             </w:tcBorders>
+            <w:shd w:fill="D5F5E3" w:val="clear"/>
             <w:tcMar>
               <w:top w:type="dxa" w:w="80"/>
               <w:left w:type="dxa" w:w="120"/>
@@ -1800,6 +1801,7 @@
               <w:bottom w:val="single" w:color="CCCCCC" w:sz="1"/>
               <w:right w:val="single" w:color="CCCCCC" w:sz="1"/>
             </w:tcBorders>
+            <w:shd w:fill="D5F5E3" w:val="clear"/>
             <w:tcMar>
               <w:top w:type="dxa" w:w="80"/>
               <w:left w:type="dxa" w:w="120"/>
@@ -1827,21 +1829,22 @@
               <w:bottom w:val="single" w:color="CCCCCC" w:sz="1"/>
               <w:right w:val="single" w:color="CCCCCC" w:sz="1"/>
             </w:tcBorders>
-            <w:tcMar>
-              <w:top w:type="dxa" w:w="80"/>
-              <w:left w:type="dxa" w:w="120"/>
-              <w:bottom w:type="dxa" w:w="80"/>
-              <w:right w:type="dxa" w:w="120"/>
-            </w:tcMar>
-          </w:tcPr>
-          <w:p>
-            <w:r>
-              <w:rPr>
-                <w:rFonts w:ascii="Arial" w:cs="Arial" w:eastAsia="Arial" w:hAnsi="Arial"/>
-                <w:sz w:val="20"/>
-                <w:szCs w:val="20"/>
-              </w:rPr>
-              <w:t xml:space="preserve">Lister explicitement les méthodes (GET, POST, PATCH, DELETE) et headers autorisés</w:t>
+            <w:shd w:fill="D5F5E3" w:val="clear"/>
+            <w:tcMar>
+              <w:top w:type="dxa" w:w="80"/>
+              <w:left w:type="dxa" w:w="120"/>
+              <w:bottom w:type="dxa" w:w="80"/>
+              <w:right w:type="dxa" w:w="120"/>
+            </w:tcMar>
+          </w:tcPr>
+          <w:p>
+            <w:r>
+              <w:rPr>
+                <w:rFonts w:ascii="Arial" w:cs="Arial" w:eastAsia="Arial" w:hAnsi="Arial"/>
+                <w:sz w:val="20"/>
+                <w:szCs w:val="20"/>
+              </w:rPr>
+              <w:t xml:space="preserve">✓ Corrigé : méthodes et headers listés explicitement (GET, POST, PUT, DELETE / Authorization, Content-Type)</w:t>
             </w:r>
           </w:p>
         </w:tc>
@@ -1856,7 +1859,7 @@
               <w:bottom w:val="single" w:color="CCCCCC" w:sz="1"/>
               <w:right w:val="single" w:color="CCCCCC" w:sz="1"/>
             </w:tcBorders>
-            <w:shd w:fill="D6EAF8" w:val="clear"/>
+            <w:shd w:fill="D5F5E3" w:val="clear"/>
             <w:tcMar>
               <w:top w:type="dxa" w:w="80"/>
               <w:left w:type="dxa" w:w="120"/>
@@ -1874,11 +1877,11 @@
                 <w:rFonts w:ascii="Arial" w:cs="Arial" w:eastAsia="Arial" w:hAnsi="Arial"/>
                 <w:b/>
                 <w:bCs/>
-                <w:color w:val="2980B9"/>
+                <w:color w:val="1E8449"/>
                 <w:sz w:val="18"/>
                 <w:szCs w:val="18"/>
               </w:rPr>
-              <w:t xml:space="preserve">MINEUR</w:t>
+              <w:t xml:space="preserve">✓ CORRIGÉ</w:t>
             </w:r>
           </w:p>
         </w:tc>
@@ -1891,6 +1894,7 @@
               <w:bottom w:val="single" w:color="CCCCCC" w:sz="1"/>
               <w:right w:val="single" w:color="CCCCCC" w:sz="1"/>
             </w:tcBorders>
+            <w:shd w:fill="D5F5E3" w:val="clear"/>
             <w:tcMar>
               <w:top w:type="dxa" w:w="80"/>
               <w:left w:type="dxa" w:w="120"/>
@@ -1921,6 +1925,7 @@
               <w:bottom w:val="single" w:color="CCCCCC" w:sz="1"/>
               <w:right w:val="single" w:color="CCCCCC" w:sz="1"/>
             </w:tcBorders>
+            <w:shd w:fill="D5F5E3" w:val="clear"/>
             <w:tcMar>
               <w:top w:type="dxa" w:w="80"/>
               <w:left w:type="dxa" w:w="120"/>
@@ -1948,21 +1953,22 @@
               <w:bottom w:val="single" w:color="CCCCCC" w:sz="1"/>
               <w:right w:val="single" w:color="CCCCCC" w:sz="1"/>
             </w:tcBorders>
-            <w:tcMar>
-              <w:top w:type="dxa" w:w="80"/>
-              <w:left w:type="dxa" w:w="120"/>
-              <w:bottom w:type="dxa" w:w="80"/>
-              <w:right w:type="dxa" w:w="120"/>
-            </w:tcMar>
-          </w:tcPr>
-          <w:p>
-            <w:r>
-              <w:rPr>
-                <w:rFonts w:ascii="Arial" w:cs="Arial" w:eastAsia="Arial" w:hAnsi="Arial"/>
-                <w:sz w:val="20"/>
-                <w:szCs w:val="20"/>
-              </w:rPr>
-              <w:t xml:space="preserve">Centraliser dans app.core.config.Settings pour cohérence et testabilité</w:t>
+            <w:shd w:fill="D5F5E3" w:val="clear"/>
+            <w:tcMar>
+              <w:top w:type="dxa" w:w="80"/>
+              <w:left w:type="dxa" w:w="120"/>
+              <w:bottom w:type="dxa" w:w="80"/>
+              <w:right w:type="dxa" w:w="120"/>
+            </w:tcMar>
+          </w:tcPr>
+          <w:p>
+            <w:r>
+              <w:rPr>
+                <w:rFonts w:ascii="Arial" w:cs="Arial" w:eastAsia="Arial" w:hAnsi="Arial"/>
+                <w:sz w:val="20"/>
+                <w:szCs w:val="20"/>
+              </w:rPr>
+              <w:t xml:space="preserve">✓ Corrigé : RESEND_API_KEY et CONTACT_RECEIVER_EMAILS ajoutés dans Settings, email_service.py passe par settings</w:t>
             </w:r>
           </w:p>
         </w:tc>
@@ -1977,7 +1983,7 @@
               <w:bottom w:val="single" w:color="CCCCCC" w:sz="1"/>
               <w:right w:val="single" w:color="CCCCCC" w:sz="1"/>
             </w:tcBorders>
-            <w:shd w:fill="D6EAF8" w:val="clear"/>
+            <w:shd w:fill="D5F5E3" w:val="clear"/>
             <w:tcMar>
               <w:top w:type="dxa" w:w="80"/>
               <w:left w:type="dxa" w:w="120"/>
@@ -1995,11 +2001,11 @@
                 <w:rFonts w:ascii="Arial" w:cs="Arial" w:eastAsia="Arial" w:hAnsi="Arial"/>
                 <w:b/>
                 <w:bCs/>
-                <w:color w:val="2980B9"/>
+                <w:color w:val="1E8449"/>
                 <w:sz w:val="18"/>
                 <w:szCs w:val="18"/>
               </w:rPr>
-              <w:t xml:space="preserve">MINEUR</w:t>
+              <w:t xml:space="preserve">✓ CORRIGÉ</w:t>
             </w:r>
           </w:p>
         </w:tc>
@@ -2012,6 +2018,7 @@
               <w:bottom w:val="single" w:color="CCCCCC" w:sz="1"/>
               <w:right w:val="single" w:color="CCCCCC" w:sz="1"/>
             </w:tcBorders>
+            <w:shd w:fill="D5F5E3" w:val="clear"/>
             <w:tcMar>
               <w:top w:type="dxa" w:w="80"/>
               <w:left w:type="dxa" w:w="120"/>
@@ -2042,6 +2049,7 @@
               <w:bottom w:val="single" w:color="CCCCCC" w:sz="1"/>
               <w:right w:val="single" w:color="CCCCCC" w:sz="1"/>
             </w:tcBorders>
+            <w:shd w:fill="D5F5E3" w:val="clear"/>
             <w:tcMar>
               <w:top w:type="dxa" w:w="80"/>
               <w:left w:type="dxa" w:w="120"/>
@@ -2069,21 +2077,22 @@
               <w:bottom w:val="single" w:color="CCCCCC" w:sz="1"/>
               <w:right w:val="single" w:color="CCCCCC" w:sz="1"/>
             </w:tcBorders>
-            <w:tcMar>
-              <w:top w:type="dxa" w:w="80"/>
-              <w:left w:type="dxa" w:w="120"/>
-              <w:bottom w:type="dxa" w:w="80"/>
-              <w:right w:type="dxa" w:w="120"/>
-            </w:tcMar>
-          </w:tcPr>
-          <w:p>
-            <w:r>
-              <w:rPr>
-                <w:rFonts w:ascii="Arial" w:cs="Arial" w:eastAsia="Arial" w:hAnsi="Arial"/>
-                <w:sz w:val="20"/>
-                <w:szCs w:val="20"/>
-              </w:rPr>
-              <w:t xml:space="preserve">Garder une seule entrée image/jpeg: '.jpg', ajouter image/jpeg si souhaité comme alias séparé</w:t>
+            <w:shd w:fill="D5F5E3" w:val="clear"/>
+            <w:tcMar>
+              <w:top w:type="dxa" w:w="80"/>
+              <w:left w:type="dxa" w:w="120"/>
+              <w:bottom w:type="dxa" w:w="80"/>
+              <w:right w:type="dxa" w:w="120"/>
+            </w:tcMar>
+          </w:tcPr>
+          <w:p>
+            <w:r>
+              <w:rPr>
+                <w:rFonts w:ascii="Arial" w:cs="Arial" w:eastAsia="Arial" w:hAnsi="Arial"/>
+                <w:sz w:val="20"/>
+                <w:szCs w:val="20"/>
+              </w:rPr>
+              <w:t xml:space="preserve">✓ Corrigé : clés distinctes image/jpg et image/jpeg dans le dictionnaire</w:t>
             </w:r>
           </w:p>
         </w:tc>
@@ -5624,7 +5633,7 @@
           <w:sz w:val="22"/>
           <w:szCs w:val="22"/>
         </w:rPr>
-        <w:t xml:space="preserve">Backend : centraliser la config email dans Settings</w:t>
+        <w:t xml:space="preserve">✓ Backend : config email centralisée dans Settings — CORRIGÉ</w:t>
       </w:r>
     </w:p>
     <w:p>

</xml_diff>

<commit_message>
feat(backend): ajoute max_length sur les champs texte des formulaires contact et reprise
</commit_message>
<xml_diff>
--- a/Audit_GLF.docx
+++ b/Audit_GLF.docx
@@ -5613,7 +5613,7 @@
           <w:sz w:val="22"/>
           <w:szCs w:val="22"/>
         </w:rPr>
-        <w:t xml:space="preserve">Backend : mettre en place Alembic pour les migrations</w:t>
+        <w:t xml:space="preserve">✓ Backend : Alembic mis en place, migration initiale appliquée, create_all() supprimé — CORRIGÉ</w:t>
       </w:r>
     </w:p>
     <w:p>
@@ -5653,7 +5653,7 @@
           <w:sz w:val="22"/>
           <w:szCs w:val="22"/>
         </w:rPr>
-        <w:t xml:space="preserve">Backend : ajouter total_count dans les réponses paginées</w:t>
+        <w:t xml:space="preserve">Backend : ajouter total_count dans les réponses paginées — en attente</w:t>
       </w:r>
     </w:p>
     <w:p>

</xml_diff>